<commit_message>
Add Part 2 video link
</commit_message>
<xml_diff>
--- a/(CLDV6212)AIDECLARATION.docx
+++ b/(CLDV6212)AIDECLARATION.docx
@@ -606,7 +606,13 @@
         <w:rPr>
           <w:rFonts w:ascii="Arial" w:hAnsi="Arial" w:cs="Arial"/>
         </w:rPr>
-        <w:t xml:space="preserve"> to guide me through the part 1 assignment</w:t>
+        <w:t xml:space="preserve"> to guide me through the part 2 </w:t>
+      </w:r>
+      <w:r>
+        <w:rPr>
+          <w:rFonts w:ascii="Arial" w:hAnsi="Arial" w:cs="Arial"/>
+        </w:rPr>
+        <w:t>assignment</w:t>
       </w:r>
       <w:r>
         <w:rPr>
@@ -624,16 +630,45 @@
     <w:p>
       <w:pPr>
         <w:rPr>
+          <w:rFonts w:ascii="Brush Script MT" w:hAnsi="Brush Script MT" w:cs="Arial"/>
+        </w:rPr>
+      </w:pPr>
+      <w:r>
+        <w:rPr>
+          <w:rFonts w:ascii="Arial" w:hAnsi="Arial" w:cs="Arial"/>
+        </w:rPr>
+        <w:t xml:space="preserve">Signature: </w:t>
+      </w:r>
+      <w:proofErr w:type="spellStart"/>
+      <w:r>
+        <w:rPr>
+          <w:rFonts w:ascii="Brush Script MT" w:hAnsi="Brush Script MT" w:cs="Arial"/>
+        </w:rPr>
+        <w:t>s.magobongo</w:t>
+      </w:r>
+      <w:proofErr w:type="spellEnd"/>
+    </w:p>
+    <w:p>
+      <w:pPr>
+        <w:rPr>
+          <w:rFonts w:ascii="Arial" w:hAnsi="Arial" w:cs="Arial"/>
+        </w:rPr>
+      </w:pPr>
+      <w:r>
+        <w:rPr>
+          <w:rFonts w:ascii="Arial" w:hAnsi="Arial" w:cs="Arial"/>
+        </w:rPr>
+        <w:t>Date: 11 October 2026</w:t>
+      </w:r>
+    </w:p>
+    <w:p>
+      <w:pPr>
+        <w:rPr>
           <w:rFonts w:ascii="Arial" w:hAnsi="Arial" w:cs="Arial"/>
         </w:rPr>
       </w:pPr>
     </w:p>
     <w:p>
-      <w:pPr>
-        <w:rPr>
-          <w:rFonts w:ascii="Arial" w:hAnsi="Arial" w:cs="Arial"/>
-        </w:rPr>
-      </w:pPr>
       <w:r>
         <w:rPr>
           <w:rFonts w:ascii="Arial" w:hAnsi="Arial" w:cs="Arial"/>
@@ -659,7 +694,7 @@
           <w:rFonts w:ascii="Arial" w:hAnsi="Arial" w:cs="Arial"/>
           <w:i/>
         </w:rPr>
-        <w:t>Guide me through the part 1</w:t>
+        <w:t>Guide Part 2</w:t>
       </w:r>
       <w:r>
         <w:rPr>
@@ -669,24 +704,38 @@
       </w:r>
       <w:r>
         <w:t xml:space="preserve"> </w:t>
+      </w:r>
+      <w:r>
+        <w:t xml:space="preserve">  </w:t>
       </w:r>
       <w:hyperlink r:id="rId5" w:history="1">
         <w:r>
           <w:rPr>
             <w:rStyle w:val="Hyperlink"/>
-            <w:rFonts w:ascii="Arial" w:hAnsi="Arial" w:cs="Arial"/>
           </w:rPr>
-          <w:t>https://chatgpt.com/</w:t>
+          <w:t>https://chatgpt.com/share/6acb8b24-1184-83ea-906d-616b2d0c3cac</w:t>
         </w:r>
       </w:hyperlink>
       <w:r>
-        <w:rPr>
-          <w:rFonts w:ascii="Arial" w:hAnsi="Arial" w:cs="Arial"/>
-        </w:rPr>
-        <w:t xml:space="preserve">  [Accessed on 13 September 2026])</w:t>
+        <w:t xml:space="preserve"> </w:t>
       </w:r>
       <w:bookmarkStart w:id="0" w:name="_GoBack"/>
       <w:bookmarkEnd w:id="0"/>
+      <w:r>
+        <w:t xml:space="preserve">  </w:t>
+      </w:r>
+      <w:r>
+        <w:rPr>
+          <w:rFonts w:ascii="Arial" w:hAnsi="Arial" w:cs="Arial"/>
+        </w:rPr>
+        <w:t>[Accessed on 11 October</w:t>
+      </w:r>
+      <w:r>
+        <w:rPr>
+          <w:rFonts w:ascii="Arial" w:hAnsi="Arial" w:cs="Arial"/>
+        </w:rPr>
+        <w:t xml:space="preserve"> 2026])</w:t>
+      </w:r>
     </w:p>
     <w:sectPr>
       <w:pgSz w:w="12240" w:h="15840"/>

</xml_diff>